<commit_message>
3 and 4 answer spec math
</commit_message>
<xml_diff>
--- a/Специальные разделы математики/Сессия/Учебные вопросы.docx
+++ b/Специальные разделы математики/Сессия/Учебные вопросы.docx
@@ -1514,6 +1514,9 @@
         <w:jc w:val="center"/>
       </w:pPr>
       <w:r>
+        <w:rPr>
+          <w:noProof/>
+        </w:rPr>
         <w:lastRenderedPageBreak/>
         <w:drawing>
           <wp:inline distT="0" distB="0" distL="0" distR="0" wp14:anchorId="3D7B8128" wp14:editId="0E0E2800">
@@ -1557,6 +1560,9 @@
         <w:jc w:val="center"/>
       </w:pPr>
       <w:r>
+        <w:rPr>
+          <w:noProof/>
+        </w:rPr>
         <w:drawing>
           <wp:inline distT="0" distB="0" distL="0" distR="0" wp14:anchorId="568DBAF4" wp14:editId="42132BC2">
             <wp:extent cx="5240655" cy="4541520"/>
@@ -1600,6 +1606,9 @@
         <w:jc w:val="center"/>
       </w:pPr>
       <w:r>
+        <w:rPr>
+          <w:noProof/>
+        </w:rPr>
         <w:lastRenderedPageBreak/>
         <w:drawing>
           <wp:inline distT="0" distB="0" distL="0" distR="0" wp14:anchorId="7D28E509" wp14:editId="4ECB61AE">
@@ -1643,6 +1652,9 @@
         <w:jc w:val="center"/>
       </w:pPr>
       <w:r>
+        <w:rPr>
+          <w:noProof/>
+        </w:rPr>
         <w:drawing>
           <wp:inline distT="0" distB="0" distL="0" distR="0" wp14:anchorId="720A25CA" wp14:editId="4D0E31BF">
             <wp:extent cx="6120765" cy="2080260"/>
@@ -1685,6 +1697,9 @@
         <w:jc w:val="center"/>
       </w:pPr>
       <w:r>
+        <w:rPr>
+          <w:noProof/>
+        </w:rPr>
         <w:drawing>
           <wp:inline distT="0" distB="0" distL="0" distR="0" wp14:anchorId="4A5B4F1F" wp14:editId="4FC19450">
             <wp:extent cx="6120765" cy="3230880"/>
@@ -1822,10 +1837,7 @@
         <w:t>β</w:t>
       </w:r>
       <w:r>
-        <w:t>)</w:t>
-      </w:r>
-      <w:r>
-        <w:t xml:space="preserve"> </w:t>
+        <w:t xml:space="preserve">) </w:t>
       </w:r>
       <w:r>
         <w:t xml:space="preserve">операций. </w:t>
@@ -1854,7 +1866,13 @@
         <w:t xml:space="preserve">x </w:t>
       </w:r>
       <w:r>
-        <w:t xml:space="preserve"> </w:t>
+        <w:rPr>
+          <w:rFonts w:ascii="Cambria Math" w:hAnsi="Cambria Math" w:cs="Cambria Math"/>
+        </w:rPr>
+        <w:t>∈</w:t>
+      </w:r>
+      <w:r>
+        <w:t xml:space="preserve"> </w:t>
       </w:r>
       <w:r>
         <w:rPr>
@@ -1894,7 +1912,13 @@
         <w:t xml:space="preserve">у </w:t>
       </w:r>
       <w:r>
-        <w:t xml:space="preserve"> </w:t>
+        <w:rPr>
+          <w:rFonts w:ascii="Cambria Math" w:hAnsi="Cambria Math" w:cs="Cambria Math"/>
+        </w:rPr>
+        <w:t>∈</w:t>
+      </w:r>
+      <w:r>
+        <w:t xml:space="preserve"> </w:t>
       </w:r>
       <w:r>
         <w:rPr>
@@ -2039,7 +2063,7 @@
     </w:p>
     <w:p>
       <w:r>
-        <w:t xml:space="preserve">Принципиальным условием однонаправленности функции является сложность (невозможность) вычисления обратного преобразования, т. е. отсут- ствие эффективных алгоритмов нахождения по значению функции значения ар- гумента. Обратное преобразование к ОНФ может существовать, но не являться функцией в смысле определения. Обратное преобразование может быть также неоднозначным, т. е. практически для всех </w:t>
+        <w:t xml:space="preserve">Принципиальным условием однонаправленности функции является сложность (невозможность) вычисления обратного преобразования, т. е. отсутствие эффективных алгоритмов нахождения по значению функции значения ар- гумента. Обратное преобразование к ОНФ может существовать, но не являться функцией в смысле определения. Обратное преобразование может быть также неоднозначным, т. е. практически для всех </w:t>
       </w:r>
       <w:r>
         <w:rPr>
@@ -2160,6 +2184,9 @@
     </w:p>
     <w:p>
       <w:r>
+        <w:rPr>
+          <w:noProof/>
+        </w:rPr>
         <w:drawing>
           <wp:inline distT="0" distB="0" distL="0" distR="0" wp14:anchorId="72C2A2BF" wp14:editId="1E27904F">
             <wp:extent cx="6120765" cy="2406650"/>
@@ -2200,7 +2227,477 @@
     <w:p>
       <w:r>
         <w:lastRenderedPageBreak/>
-        <w:t xml:space="preserve">3. Принципы построения линейных регистров сдвига: схема Фибоначчи, схема Галуа, описание линейных регистров сдвига с помощью многочленов в прямой и двойственной форме, примитивный полином. </w:t>
+        <w:t>3. Принципы построения линейных регистров сдвига: схема Фибоначчи, схема Галуа, описание линейных регистров сдвига с помощью многочленов в прямой и двойственной форме, примитивный полином.</w:t>
+      </w:r>
+    </w:p>
+    <w:p>
+      <w:r>
+        <w:t xml:space="preserve"> </w:t>
+      </w:r>
+      <w:r>
+        <w:rPr>
+          <w:i/>
+          <w:iCs/>
+        </w:rPr>
+        <w:t xml:space="preserve">Линейным регистром сдвига </w:t>
+      </w:r>
+      <w:r>
+        <w:t xml:space="preserve">(ЛРС) называется регистр сдвига с линейной обратной связью, т. е. у которого входной бит является линейной булевой функцией от значений остальных битов регистра до сдвига. В качестве линейной булевой функции в таких регистрах применяется сложение </w:t>
+      </w:r>
+      <w:r>
+        <w:t xml:space="preserve"> </w:t>
+      </w:r>
+      <w:r>
+        <w:t xml:space="preserve">по модулю 2. Другие названия ЛРС, встречаемые в литературе, – рекуррентная линия задержки (РЛЗ), одноканальная линия задержки (ОЛЗ) с обратной связью, саморазвертка, англ. </w:t>
+      </w:r>
+      <w:r>
+        <w:rPr>
+          <w:i/>
+          <w:iCs/>
+        </w:rPr>
+        <w:t xml:space="preserve">Linear Feedback Shift Register </w:t>
+      </w:r>
+      <w:r>
+        <w:t>(</w:t>
+      </w:r>
+      <w:r>
+        <w:rPr>
+          <w:i/>
+          <w:iCs/>
+        </w:rPr>
+        <w:t>LFSR</w:t>
+      </w:r>
+      <w:r>
+        <w:t xml:space="preserve">). </w:t>
+      </w:r>
+    </w:p>
+    <w:p>
+      <w:r>
+        <w:t>В общем виде ЛРС может быть представлен в виде схемы Фибоначчи,</w:t>
+      </w:r>
+    </w:p>
+    <w:p>
+      <w:r>
+        <w:t>представленной на рисунке 1.1. Согласно данной схеме, a</w:t>
+      </w:r>
+      <w:r>
+        <w:rPr>
+          <w:vertAlign w:val="subscript"/>
+          <w:lang w:val="en-US"/>
+        </w:rPr>
+        <w:t>i</w:t>
+      </w:r>
+      <w:r>
+        <w:t xml:space="preserve"> </w:t>
+      </w:r>
+      <w:r>
+        <w:rPr>
+          <w:rFonts w:ascii="Cambria Math" w:hAnsi="Cambria Math" w:cs="Cambria Math"/>
+        </w:rPr>
+        <w:t>∈</w:t>
+      </w:r>
+      <w:r>
+        <w:t xml:space="preserve"> </w:t>
+      </w:r>
+      <w:r>
+        <w:t>{0,1}</w:t>
+      </w:r>
+      <w:r>
+        <w:rPr>
+          <w:lang w:val="en-US"/>
+        </w:rPr>
+        <w:t xml:space="preserve"> </w:t>
+      </w:r>
+      <w:r>
+        <w:t>– элемент</w:t>
+      </w:r>
+    </w:p>
+    <w:p>
+      <w:r>
+        <w:t xml:space="preserve">памяти регистра сдвига, </w:t>
+      </w:r>
+      <w:r>
+        <w:t>h</w:t>
+      </w:r>
+      <w:r>
+        <w:rPr>
+          <w:vertAlign w:val="subscript"/>
+          <w:lang w:val="en-US"/>
+        </w:rPr>
+        <w:t>i</w:t>
+      </w:r>
+      <w:r>
+        <w:rPr>
+          <w:rFonts w:ascii="Cambria Math" w:hAnsi="Cambria Math" w:cs="Cambria Math"/>
+        </w:rPr>
+        <w:t xml:space="preserve"> </w:t>
+      </w:r>
+      <w:r>
+        <w:rPr>
+          <w:rFonts w:ascii="Cambria Math" w:hAnsi="Cambria Math" w:cs="Cambria Math"/>
+        </w:rPr>
+        <w:t>∈</w:t>
+      </w:r>
+      <w:r>
+        <w:t xml:space="preserve"> </w:t>
+      </w:r>
+      <w:r>
+        <w:t>{0,1}</w:t>
+      </w:r>
+      <w:r>
+        <w:t xml:space="preserve"> </w:t>
+      </w:r>
+      <w:r>
+        <w:t>– обратная связь с i-й ячейки (если обратная</w:t>
+      </w:r>
+    </w:p>
+    <w:p>
+      <w:pPr>
+        <w:rPr>
+          <w:lang w:val="en-US"/>
+        </w:rPr>
+      </w:pPr>
+      <w:r>
+        <w:t>связь с i-й ячейки присутствует, то h</w:t>
+      </w:r>
+      <w:r>
+        <w:rPr>
+          <w:vertAlign w:val="subscript"/>
+          <w:lang w:val="en-US"/>
+        </w:rPr>
+        <w:t>i</w:t>
+      </w:r>
+      <w:r>
+        <w:t xml:space="preserve"> = 1, в противном случае h</w:t>
+      </w:r>
+      <w:r>
+        <w:rPr>
+          <w:vertAlign w:val="subscript"/>
+          <w:lang w:val="en-US"/>
+        </w:rPr>
+        <w:t>i</w:t>
+      </w:r>
+      <w:r>
+        <w:t xml:space="preserve"> = 0).</w:t>
+      </w:r>
+      <w:r>
+        <w:drawing>
+          <wp:inline distT="0" distB="0" distL="0" distR="0" wp14:anchorId="4B0D78DD" wp14:editId="63C8F8BC">
+            <wp:extent cx="6120765" cy="1833245"/>
+            <wp:effectExtent l="0" t="0" r="0" b="0"/>
+            <wp:docPr id="1739490160" name="Рисунок 1"/>
+            <wp:cNvGraphicFramePr>
+              <a:graphicFrameLocks xmlns:a="http://schemas.openxmlformats.org/drawingml/2006/main" noChangeAspect="1"/>
+            </wp:cNvGraphicFramePr>
+            <a:graphic xmlns:a="http://schemas.openxmlformats.org/drawingml/2006/main">
+              <a:graphicData uri="http://schemas.openxmlformats.org/drawingml/2006/picture">
+                <pic:pic xmlns:pic="http://schemas.openxmlformats.org/drawingml/2006/picture">
+                  <pic:nvPicPr>
+                    <pic:cNvPr id="1739490160" name=""/>
+                    <pic:cNvPicPr/>
+                  </pic:nvPicPr>
+                  <pic:blipFill>
+                    <a:blip r:embed="rId12"/>
+                    <a:stretch>
+                      <a:fillRect/>
+                    </a:stretch>
+                  </pic:blipFill>
+                  <pic:spPr>
+                    <a:xfrm>
+                      <a:off x="0" y="0"/>
+                      <a:ext cx="6120765" cy="1833245"/>
+                    </a:xfrm>
+                    <a:prstGeom prst="rect">
+                      <a:avLst/>
+                    </a:prstGeom>
+                  </pic:spPr>
+                </pic:pic>
+              </a:graphicData>
+            </a:graphic>
+          </wp:inline>
+        </w:drawing>
+      </w:r>
+    </w:p>
+    <w:p>
+      <w:pPr>
+        <w:rPr>
+          <w:lang w:val="en-US"/>
+        </w:rPr>
+      </w:pPr>
+      <w:r>
+        <w:rPr>
+          <w:lang w:val="en-US"/>
+        </w:rPr>
+        <w:lastRenderedPageBreak/>
+        <w:drawing>
+          <wp:inline distT="0" distB="0" distL="0" distR="0" wp14:anchorId="0FDEA4A1" wp14:editId="7B78996A">
+            <wp:extent cx="6120765" cy="3592195"/>
+            <wp:effectExtent l="0" t="0" r="0" b="8255"/>
+            <wp:docPr id="1581974206" name="Рисунок 1"/>
+            <wp:cNvGraphicFramePr>
+              <a:graphicFrameLocks xmlns:a="http://schemas.openxmlformats.org/drawingml/2006/main" noChangeAspect="1"/>
+            </wp:cNvGraphicFramePr>
+            <a:graphic xmlns:a="http://schemas.openxmlformats.org/drawingml/2006/main">
+              <a:graphicData uri="http://schemas.openxmlformats.org/drawingml/2006/picture">
+                <pic:pic xmlns:pic="http://schemas.openxmlformats.org/drawingml/2006/picture">
+                  <pic:nvPicPr>
+                    <pic:cNvPr id="1581974206" name=""/>
+                    <pic:cNvPicPr/>
+                  </pic:nvPicPr>
+                  <pic:blipFill>
+                    <a:blip r:embed="rId13"/>
+                    <a:stretch>
+                      <a:fillRect/>
+                    </a:stretch>
+                  </pic:blipFill>
+                  <pic:spPr>
+                    <a:xfrm>
+                      <a:off x="0" y="0"/>
+                      <a:ext cx="6120765" cy="3592195"/>
+                    </a:xfrm>
+                    <a:prstGeom prst="rect">
+                      <a:avLst/>
+                    </a:prstGeom>
+                  </pic:spPr>
+                </pic:pic>
+              </a:graphicData>
+            </a:graphic>
+          </wp:inline>
+        </w:drawing>
+      </w:r>
+    </w:p>
+    <w:p>
+      <w:pPr>
+        <w:rPr>
+          <w:lang w:val="en-US"/>
+        </w:rPr>
+      </w:pPr>
+      <w:r>
+        <w:rPr>
+          <w:lang w:val="en-US"/>
+        </w:rPr>
+        <w:drawing>
+          <wp:inline distT="0" distB="0" distL="0" distR="0" wp14:anchorId="704D56AD" wp14:editId="667327F9">
+            <wp:extent cx="6120765" cy="3601085"/>
+            <wp:effectExtent l="0" t="0" r="0" b="0"/>
+            <wp:docPr id="1435045945" name="Рисунок 1"/>
+            <wp:cNvGraphicFramePr>
+              <a:graphicFrameLocks xmlns:a="http://schemas.openxmlformats.org/drawingml/2006/main" noChangeAspect="1"/>
+            </wp:cNvGraphicFramePr>
+            <a:graphic xmlns:a="http://schemas.openxmlformats.org/drawingml/2006/main">
+              <a:graphicData uri="http://schemas.openxmlformats.org/drawingml/2006/picture">
+                <pic:pic xmlns:pic="http://schemas.openxmlformats.org/drawingml/2006/picture">
+                  <pic:nvPicPr>
+                    <pic:cNvPr id="1435045945" name=""/>
+                    <pic:cNvPicPr/>
+                  </pic:nvPicPr>
+                  <pic:blipFill>
+                    <a:blip r:embed="rId14"/>
+                    <a:stretch>
+                      <a:fillRect/>
+                    </a:stretch>
+                  </pic:blipFill>
+                  <pic:spPr>
+                    <a:xfrm>
+                      <a:off x="0" y="0"/>
+                      <a:ext cx="6120765" cy="3601085"/>
+                    </a:xfrm>
+                    <a:prstGeom prst="rect">
+                      <a:avLst/>
+                    </a:prstGeom>
+                  </pic:spPr>
+                </pic:pic>
+              </a:graphicData>
+            </a:graphic>
+          </wp:inline>
+        </w:drawing>
+      </w:r>
+    </w:p>
+    <w:p>
+      <w:pPr>
+        <w:rPr>
+          <w:lang w:val="en-US"/>
+        </w:rPr>
+      </w:pPr>
+      <w:r>
+        <w:rPr>
+          <w:lang w:val="en-US"/>
+        </w:rPr>
+        <w:drawing>
+          <wp:inline distT="0" distB="0" distL="0" distR="0" wp14:anchorId="697ADE43" wp14:editId="775B0FE7">
+            <wp:extent cx="6120765" cy="1489710"/>
+            <wp:effectExtent l="0" t="0" r="0" b="0"/>
+            <wp:docPr id="1711374271" name="Рисунок 1"/>
+            <wp:cNvGraphicFramePr>
+              <a:graphicFrameLocks xmlns:a="http://schemas.openxmlformats.org/drawingml/2006/main" noChangeAspect="1"/>
+            </wp:cNvGraphicFramePr>
+            <a:graphic xmlns:a="http://schemas.openxmlformats.org/drawingml/2006/main">
+              <a:graphicData uri="http://schemas.openxmlformats.org/drawingml/2006/picture">
+                <pic:pic xmlns:pic="http://schemas.openxmlformats.org/drawingml/2006/picture">
+                  <pic:nvPicPr>
+                    <pic:cNvPr id="1711374271" name=""/>
+                    <pic:cNvPicPr/>
+                  </pic:nvPicPr>
+                  <pic:blipFill>
+                    <a:blip r:embed="rId15"/>
+                    <a:stretch>
+                      <a:fillRect/>
+                    </a:stretch>
+                  </pic:blipFill>
+                  <pic:spPr>
+                    <a:xfrm>
+                      <a:off x="0" y="0"/>
+                      <a:ext cx="6120765" cy="1489710"/>
+                    </a:xfrm>
+                    <a:prstGeom prst="rect">
+                      <a:avLst/>
+                    </a:prstGeom>
+                  </pic:spPr>
+                </pic:pic>
+              </a:graphicData>
+            </a:graphic>
+          </wp:inline>
+        </w:drawing>
+      </w:r>
+    </w:p>
+    <w:p>
+      <w:pPr>
+        <w:rPr>
+          <w:lang w:val="en-US"/>
+        </w:rPr>
+      </w:pPr>
+      <w:r>
+        <w:rPr>
+          <w:lang w:val="en-US"/>
+        </w:rPr>
+        <w:lastRenderedPageBreak/>
+        <w:drawing>
+          <wp:inline distT="0" distB="0" distL="0" distR="0" wp14:anchorId="2EDAB94E" wp14:editId="0E4EB549">
+            <wp:extent cx="6120765" cy="3429000"/>
+            <wp:effectExtent l="0" t="0" r="0" b="0"/>
+            <wp:docPr id="587018455" name="Рисунок 1"/>
+            <wp:cNvGraphicFramePr>
+              <a:graphicFrameLocks xmlns:a="http://schemas.openxmlformats.org/drawingml/2006/main" noChangeAspect="1"/>
+            </wp:cNvGraphicFramePr>
+            <a:graphic xmlns:a="http://schemas.openxmlformats.org/drawingml/2006/main">
+              <a:graphicData uri="http://schemas.openxmlformats.org/drawingml/2006/picture">
+                <pic:pic xmlns:pic="http://schemas.openxmlformats.org/drawingml/2006/picture">
+                  <pic:nvPicPr>
+                    <pic:cNvPr id="587018455" name=""/>
+                    <pic:cNvPicPr/>
+                  </pic:nvPicPr>
+                  <pic:blipFill>
+                    <a:blip r:embed="rId16"/>
+                    <a:stretch>
+                      <a:fillRect/>
+                    </a:stretch>
+                  </pic:blipFill>
+                  <pic:spPr>
+                    <a:xfrm>
+                      <a:off x="0" y="0"/>
+                      <a:ext cx="6120765" cy="3429000"/>
+                    </a:xfrm>
+                    <a:prstGeom prst="rect">
+                      <a:avLst/>
+                    </a:prstGeom>
+                  </pic:spPr>
+                </pic:pic>
+              </a:graphicData>
+            </a:graphic>
+          </wp:inline>
+        </w:drawing>
+      </w:r>
+    </w:p>
+    <w:p>
+      <w:pPr>
+        <w:rPr>
+          <w:lang w:val="en-US"/>
+        </w:rPr>
+      </w:pPr>
+      <w:r>
+        <w:rPr>
+          <w:lang w:val="en-US"/>
+        </w:rPr>
+        <w:drawing>
+          <wp:inline distT="0" distB="0" distL="0" distR="0" wp14:anchorId="0CCDD9A6" wp14:editId="52C51E2E">
+            <wp:extent cx="6120765" cy="3406140"/>
+            <wp:effectExtent l="0" t="0" r="0" b="3810"/>
+            <wp:docPr id="689752235" name="Рисунок 1"/>
+            <wp:cNvGraphicFramePr>
+              <a:graphicFrameLocks xmlns:a="http://schemas.openxmlformats.org/drawingml/2006/main" noChangeAspect="1"/>
+            </wp:cNvGraphicFramePr>
+            <a:graphic xmlns:a="http://schemas.openxmlformats.org/drawingml/2006/main">
+              <a:graphicData uri="http://schemas.openxmlformats.org/drawingml/2006/picture">
+                <pic:pic xmlns:pic="http://schemas.openxmlformats.org/drawingml/2006/picture">
+                  <pic:nvPicPr>
+                    <pic:cNvPr id="689752235" name=""/>
+                    <pic:cNvPicPr/>
+                  </pic:nvPicPr>
+                  <pic:blipFill>
+                    <a:blip r:embed="rId17"/>
+                    <a:stretch>
+                      <a:fillRect/>
+                    </a:stretch>
+                  </pic:blipFill>
+                  <pic:spPr>
+                    <a:xfrm>
+                      <a:off x="0" y="0"/>
+                      <a:ext cx="6120765" cy="3406140"/>
+                    </a:xfrm>
+                    <a:prstGeom prst="rect">
+                      <a:avLst/>
+                    </a:prstGeom>
+                  </pic:spPr>
+                </pic:pic>
+              </a:graphicData>
+            </a:graphic>
+          </wp:inline>
+        </w:drawing>
+      </w:r>
+    </w:p>
+    <w:p>
+      <w:r>
+        <w:t>И на всякий случай..</w:t>
+      </w:r>
+    </w:p>
+    <w:p>
+      <w:r>
+        <w:lastRenderedPageBreak/>
+        <w:drawing>
+          <wp:inline distT="0" distB="0" distL="0" distR="0" wp14:anchorId="111BB628" wp14:editId="6F27C537">
+            <wp:extent cx="5982535" cy="8364117"/>
+            <wp:effectExtent l="0" t="0" r="0" b="0"/>
+            <wp:docPr id="1479749282" name="Рисунок 1"/>
+            <wp:cNvGraphicFramePr>
+              <a:graphicFrameLocks xmlns:a="http://schemas.openxmlformats.org/drawingml/2006/main" noChangeAspect="1"/>
+            </wp:cNvGraphicFramePr>
+            <a:graphic xmlns:a="http://schemas.openxmlformats.org/drawingml/2006/main">
+              <a:graphicData uri="http://schemas.openxmlformats.org/drawingml/2006/picture">
+                <pic:pic xmlns:pic="http://schemas.openxmlformats.org/drawingml/2006/picture">
+                  <pic:nvPicPr>
+                    <pic:cNvPr id="1479749282" name=""/>
+                    <pic:cNvPicPr/>
+                  </pic:nvPicPr>
+                  <pic:blipFill>
+                    <a:blip r:embed="rId18"/>
+                    <a:stretch>
+                      <a:fillRect/>
+                    </a:stretch>
+                  </pic:blipFill>
+                  <pic:spPr>
+                    <a:xfrm>
+                      <a:off x="0" y="0"/>
+                      <a:ext cx="5982535" cy="8364117"/>
+                    </a:xfrm>
+                    <a:prstGeom prst="rect">
+                      <a:avLst/>
+                    </a:prstGeom>
+                  </pic:spPr>
+                </pic:pic>
+              </a:graphicData>
+            </a:graphic>
+          </wp:inline>
+        </w:drawing>
       </w:r>
     </w:p>
     <w:p>
@@ -2209,6 +2706,134 @@
       </w:r>
     </w:p>
     <w:p>
+      <w:pPr>
+        <w:jc w:val="center"/>
+      </w:pPr>
+      <w:r>
+        <w:lastRenderedPageBreak/>
+        <w:drawing>
+          <wp:inline distT="0" distB="0" distL="0" distR="0" wp14:anchorId="6B17E2F6" wp14:editId="3D3DB3BD">
+            <wp:extent cx="5543334" cy="5394960"/>
+            <wp:effectExtent l="0" t="0" r="635" b="0"/>
+            <wp:docPr id="1216837384" name="Рисунок 1"/>
+            <wp:cNvGraphicFramePr>
+              <a:graphicFrameLocks xmlns:a="http://schemas.openxmlformats.org/drawingml/2006/main" noChangeAspect="1"/>
+            </wp:cNvGraphicFramePr>
+            <a:graphic xmlns:a="http://schemas.openxmlformats.org/drawingml/2006/main">
+              <a:graphicData uri="http://schemas.openxmlformats.org/drawingml/2006/picture">
+                <pic:pic xmlns:pic="http://schemas.openxmlformats.org/drawingml/2006/picture">
+                  <pic:nvPicPr>
+                    <pic:cNvPr id="1216837384" name=""/>
+                    <pic:cNvPicPr/>
+                  </pic:nvPicPr>
+                  <pic:blipFill>
+                    <a:blip r:embed="rId19"/>
+                    <a:stretch>
+                      <a:fillRect/>
+                    </a:stretch>
+                  </pic:blipFill>
+                  <pic:spPr>
+                    <a:xfrm>
+                      <a:off x="0" y="0"/>
+                      <a:ext cx="5545686" cy="5397249"/>
+                    </a:xfrm>
+                    <a:prstGeom prst="rect">
+                      <a:avLst/>
+                    </a:prstGeom>
+                  </pic:spPr>
+                </pic:pic>
+              </a:graphicData>
+            </a:graphic>
+          </wp:inline>
+        </w:drawing>
+      </w:r>
+    </w:p>
+    <w:p>
+      <w:pPr>
+        <w:jc w:val="center"/>
+      </w:pPr>
+      <w:r>
+        <w:drawing>
+          <wp:inline distT="0" distB="0" distL="0" distR="0" wp14:anchorId="4F6F0618" wp14:editId="634BD711">
+            <wp:extent cx="5402580" cy="3494106"/>
+            <wp:effectExtent l="0" t="0" r="7620" b="0"/>
+            <wp:docPr id="1941019210" name="Рисунок 1"/>
+            <wp:cNvGraphicFramePr>
+              <a:graphicFrameLocks xmlns:a="http://schemas.openxmlformats.org/drawingml/2006/main" noChangeAspect="1"/>
+            </wp:cNvGraphicFramePr>
+            <a:graphic xmlns:a="http://schemas.openxmlformats.org/drawingml/2006/main">
+              <a:graphicData uri="http://schemas.openxmlformats.org/drawingml/2006/picture">
+                <pic:pic xmlns:pic="http://schemas.openxmlformats.org/drawingml/2006/picture">
+                  <pic:nvPicPr>
+                    <pic:cNvPr id="1941019210" name=""/>
+                    <pic:cNvPicPr/>
+                  </pic:nvPicPr>
+                  <pic:blipFill>
+                    <a:blip r:embed="rId20"/>
+                    <a:stretch>
+                      <a:fillRect/>
+                    </a:stretch>
+                  </pic:blipFill>
+                  <pic:spPr>
+                    <a:xfrm>
+                      <a:off x="0" y="0"/>
+                      <a:ext cx="5406814" cy="3496844"/>
+                    </a:xfrm>
+                    <a:prstGeom prst="rect">
+                      <a:avLst/>
+                    </a:prstGeom>
+                  </pic:spPr>
+                </pic:pic>
+              </a:graphicData>
+            </a:graphic>
+          </wp:inline>
+        </w:drawing>
+      </w:r>
+    </w:p>
+    <w:p>
+      <w:pPr>
+        <w:jc w:val="center"/>
+      </w:pPr>
+      <w:r>
+        <w:lastRenderedPageBreak/>
+        <w:drawing>
+          <wp:inline distT="0" distB="0" distL="0" distR="0" wp14:anchorId="64336B29" wp14:editId="3E5C05A5">
+            <wp:extent cx="6120765" cy="2106930"/>
+            <wp:effectExtent l="0" t="0" r="0" b="7620"/>
+            <wp:docPr id="182913822" name="Рисунок 1"/>
+            <wp:cNvGraphicFramePr>
+              <a:graphicFrameLocks xmlns:a="http://schemas.openxmlformats.org/drawingml/2006/main" noChangeAspect="1"/>
+            </wp:cNvGraphicFramePr>
+            <a:graphic xmlns:a="http://schemas.openxmlformats.org/drawingml/2006/main">
+              <a:graphicData uri="http://schemas.openxmlformats.org/drawingml/2006/picture">
+                <pic:pic xmlns:pic="http://schemas.openxmlformats.org/drawingml/2006/picture">
+                  <pic:nvPicPr>
+                    <pic:cNvPr id="182913822" name=""/>
+                    <pic:cNvPicPr/>
+                  </pic:nvPicPr>
+                  <pic:blipFill>
+                    <a:blip r:embed="rId21"/>
+                    <a:stretch>
+                      <a:fillRect/>
+                    </a:stretch>
+                  </pic:blipFill>
+                  <pic:spPr>
+                    <a:xfrm>
+                      <a:off x="0" y="0"/>
+                      <a:ext cx="6120765" cy="2106930"/>
+                    </a:xfrm>
+                    <a:prstGeom prst="rect">
+                      <a:avLst/>
+                    </a:prstGeom>
+                  </pic:spPr>
+                </pic:pic>
+              </a:graphicData>
+            </a:graphic>
+          </wp:inline>
+        </w:drawing>
+      </w:r>
+    </w:p>
+    <w:p>
       <w:r>
         <w:t xml:space="preserve">5. Понятия алгебраических структур: группы, кольца, поля. </w:t>
       </w:r>
@@ -2265,6 +2890,7 @@
     </w:p>
     <w:p>
       <w:r>
+        <w:lastRenderedPageBreak/>
         <w:t xml:space="preserve">16. Основные определения, связанные с распознаванием, обобщенный алгоритм распознавания, классификация методов распознавания образов. </w:t>
       </w:r>
     </w:p>
@@ -2275,77 +2901,77 @@
     </w:p>
     <w:p>
       <w:r>
+        <w:t xml:space="preserve">18. Разделяющая функция, расстояние Махаланобиса. </w:t>
+      </w:r>
+    </w:p>
+    <w:p>
+      <w:r>
+        <w:t xml:space="preserve">19. Критерии принятия решения при обнаружении воздействий. </w:t>
+      </w:r>
+    </w:p>
+    <w:p>
+      <w:r>
+        <w:t xml:space="preserve">20. Последовательные процедуры принятия решения. </w:t>
+      </w:r>
+    </w:p>
+    <w:p>
+      <w:r>
+        <w:t xml:space="preserve">21. Постановка задачи и классификация методов обучения систем распознавания образов. </w:t>
+      </w:r>
+    </w:p>
+    <w:p>
+      <w:r>
+        <w:t xml:space="preserve">22. Обучение перцептрона. </w:t>
+      </w:r>
+    </w:p>
+    <w:p>
+      <w:r>
+        <w:t xml:space="preserve">23. Построение эталонных описаний одномерных нормальных совокупностей. </w:t>
+      </w:r>
+    </w:p>
+    <w:p>
+      <w:r>
+        <w:t xml:space="preserve">24. Критерии согласия при проверке статистических гипотез. </w:t>
+      </w:r>
+    </w:p>
+    <w:p>
+      <w:r>
+        <w:t xml:space="preserve">25. Принцип максимума энтропии при оценке плотности распределения вероятностей случайной величины. </w:t>
+      </w:r>
+    </w:p>
+    <w:p>
+      <w:r>
+        <w:t xml:space="preserve">26. Гистограммный метод оценивания плотности распределения вероятностей, полигональные оценки, метод Парзена. </w:t>
+      </w:r>
+    </w:p>
+    <w:p>
+      <w:r>
+        <w:t>27. Метод линейной комбинации базисных функций при оценке плотности распределения вероятностей.</w:t>
+      </w:r>
+    </w:p>
+    <w:p>
+      <w:r>
+        <w:t xml:space="preserve">28. Базисные функции при непараметрическом распознавании образов: многочлены Лагерра, полиномиальные функции Радемахера-Уолша. </w:t>
+      </w:r>
+    </w:p>
+    <w:p>
+      <w:r>
+        <w:t xml:space="preserve">29. Основные понятия теории информации: информация и ее свойства, виды и модели сообщений. </w:t>
+      </w:r>
+    </w:p>
+    <w:p>
+      <w:r>
+        <w:t xml:space="preserve">30. Количество информации, основные подходы к измерению количества информации, энтропия и избыточность. </w:t>
+      </w:r>
+    </w:p>
+    <w:p>
+      <w:r>
+        <w:t xml:space="preserve">31. Энтропия ансамбля, совместная энтропия, условная энтропия. </w:t>
+      </w:r>
+    </w:p>
+    <w:p>
+      <w:r>
         <w:lastRenderedPageBreak/>
-        <w:t xml:space="preserve">18. Разделяющая функция, расстояние Махаланобиса. </w:t>
-      </w:r>
-    </w:p>
-    <w:p>
-      <w:r>
-        <w:t xml:space="preserve">19. Критерии принятия решения при обнаружении воздействий. </w:t>
-      </w:r>
-    </w:p>
-    <w:p>
-      <w:r>
-        <w:t xml:space="preserve">20. Последовательные процедуры принятия решения. </w:t>
-      </w:r>
-    </w:p>
-    <w:p>
-      <w:r>
-        <w:t xml:space="preserve">21. Постановка задачи и классификация методов обучения систем распознавания образов. </w:t>
-      </w:r>
-    </w:p>
-    <w:p>
-      <w:r>
-        <w:t xml:space="preserve">22. Обучение перцептрона. </w:t>
-      </w:r>
-    </w:p>
-    <w:p>
-      <w:r>
-        <w:t xml:space="preserve">23. Построение эталонных описаний одномерных нормальных совокупностей. </w:t>
-      </w:r>
-    </w:p>
-    <w:p>
-      <w:r>
-        <w:t xml:space="preserve">24. Критерии согласия при проверке статистических гипотез. </w:t>
-      </w:r>
-    </w:p>
-    <w:p>
-      <w:r>
-        <w:t xml:space="preserve">25. Принцип максимума энтропии при оценке плотности распределения вероятностей случайной величины. </w:t>
-      </w:r>
-    </w:p>
-    <w:p>
-      <w:r>
-        <w:t xml:space="preserve">26. Гистограммный метод оценивания плотности распределения вероятностей, полигональные оценки, метод Парзена. </w:t>
-      </w:r>
-    </w:p>
-    <w:p>
-      <w:r>
-        <w:t>27. Метод линейной комбинации базисных функций при оценке плотности распределения вероятностей.</w:t>
-      </w:r>
-    </w:p>
-    <w:p>
-      <w:r>
-        <w:t xml:space="preserve">28. Базисные функции при непараметрическом распознавании образов: многочлены Лагерра, полиномиальные функции Радемахера-Уолша. </w:t>
-      </w:r>
-    </w:p>
-    <w:p>
-      <w:r>
-        <w:t xml:space="preserve">29. Основные понятия теории информации: информация и ее свойства, виды и модели сообщений. </w:t>
-      </w:r>
-    </w:p>
-    <w:p>
-      <w:r>
-        <w:t xml:space="preserve">30. Количество информации, основные подходы к измерению количества информации, энтропия и избыточность. </w:t>
-      </w:r>
-    </w:p>
-    <w:p>
-      <w:r>
-        <w:t xml:space="preserve">31. Энтропия ансамбля, совместная энтропия, условная энтропия. </w:t>
-      </w:r>
-    </w:p>
-    <w:p>
-      <w:r>
         <w:t xml:space="preserve">32. Теоремы Шеннона. </w:t>
       </w:r>
     </w:p>
@@ -2356,7 +2982,6 @@
     </w:p>
     <w:p>
       <w:r>
-        <w:lastRenderedPageBreak/>
         <w:t xml:space="preserve">34. Коды Шеннона-Фано, Хаффмана, арифметическое кодирование. </w:t>
       </w:r>
     </w:p>

</xml_diff>